<commit_message>
Changes for form validation
</commit_message>
<xml_diff>
--- a/backend/data/uploads/FR-02_spec.docx
+++ b/backend/data/uploads/FR-02_spec.docx
@@ -3,10 +3,24 @@
 <w:document xmlns:wpc="http://schemas.microsoft.com/office/word/2010/wordprocessingCanvas" xmlns:mo="http://schemas.microsoft.com/office/mac/office/2008/main" xmlns:mc="http://schemas.openxmlformats.org/markup-compatibility/2006" xmlns:mv="urn:schemas-microsoft-com:mac:vml" xmlns:o="urn:schemas-microsoft-com:office:office" xmlns:r="http://schemas.openxmlformats.org/officeDocument/2006/relationships" xmlns:m="http://schemas.openxmlformats.org/officeDocument/2006/math" xmlns:v="urn:schemas-microsoft-com:vml" xmlns:wp14="http://schemas.microsoft.com/office/word/2010/wordprocessingDrawing" xmlns:wp="http://schemas.openxmlformats.org/drawingml/2006/wordprocessingDrawing" xmlns:w10="urn:schemas-microsoft-com:office:word" xmlns:w="http://schemas.openxmlformats.org/wordprocessingml/2006/main" xmlns:w14="http://schemas.microsoft.com/office/word/2010/wordml" xmlns:wpg="http://schemas.microsoft.com/office/word/2010/wordprocessingGroup" xmlns:wpi="http://schemas.microsoft.com/office/word/2010/wordprocessingInk" xmlns:wne="http://schemas.microsoft.com/office/word/2006/wordml" xmlns:wps="http://schemas.microsoft.com/office/word/2010/wordprocessingShape" mc:Ignorable="w14 wp14">
   <w:body>
     <w:p>
+      <w:pPr>
+        <w:pStyle w:val="Heading1"/>
+        <w:jc w:val="center"/>
+      </w:pPr>
+      <w:r>
+        <w:t>FR-02 PRINT SPEC – POLICY SCHEDULE</w:t>
+      </w:r>
+    </w:p>
+    <w:p>
+      <w:r>
+        <w:t>Template Image (Actual values replaced with numeric markers)</w:t>
+      </w:r>
+    </w:p>
+    <w:p>
       <w:r>
         <w:drawing>
           <wp:inline xmlns:a="http://schemas.openxmlformats.org/drawingml/2006/main" xmlns:pic="http://schemas.openxmlformats.org/drawingml/2006/picture">
-            <wp:extent cx="5486400" cy="7481455"/>
+            <wp:extent cx="5486400" cy="7757473"/>
             <wp:docPr id="1" name="Picture 1"/>
             <wp:cNvGraphicFramePr>
               <a:graphicFrameLocks noChangeAspect="1"/>
@@ -15,7 +29,7 @@
               <a:graphicData uri="http://schemas.openxmlformats.org/drawingml/2006/picture">
                 <pic:pic>
                   <pic:nvPicPr>
-                    <pic:cNvPr id="0" name="FR02_policy_positions.png"/>
+                    <pic:cNvPr id="0" name="FR-02_MARKERS_WORKING.png"/>
                     <pic:cNvPicPr/>
                   </pic:nvPicPr>
                   <pic:blipFill>
@@ -27,7 +41,7 @@
                   <pic:spPr>
                     <a:xfrm>
                       <a:off x="0" y="0"/>
-                      <a:ext cx="5486400" cy="7481455"/>
+                      <a:ext cx="5486400" cy="7757473"/>
                     </a:xfrm>
                     <a:prstGeom prst="rect"/>
                   </pic:spPr>
@@ -36,6 +50,19 @@
             </a:graphic>
           </wp:inline>
         </w:drawing>
+      </w:r>
+    </w:p>
+    <w:p>
+      <w:r>
+        <w:br w:type="page"/>
+      </w:r>
+    </w:p>
+    <w:p>
+      <w:pPr>
+        <w:pStyle w:val="Heading2"/>
+      </w:pPr>
+      <w:r>
+        <w:t>Field Mapping Table</w:t>
       </w:r>
     </w:p>
     <w:tbl>
@@ -65,7 +92,7 @@
           </w:tcPr>
           <w:p>
             <w:r>
-              <w:t>Tag Name</w:t>
+              <w:t>Field Label</w:t>
             </w:r>
           </w:p>
         </w:tc>
@@ -97,7 +124,7 @@
           </w:tcPr>
           <w:p>
             <w:r>
-              <w:t>policyNumber</w:t>
+              <w:t>Policy Number</w:t>
             </w:r>
           </w:p>
         </w:tc>
@@ -129,7 +156,7 @@
           </w:tcPr>
           <w:p>
             <w:r>
-              <w:t>policyType</w:t>
+              <w:t>Insured Name</w:t>
             </w:r>
           </w:p>
         </w:tc>
@@ -139,7 +166,7 @@
           </w:tcPr>
           <w:p>
             <w:r>
-              <w:t>data.policy.policyType</w:t>
+              <w:t>data.customer.name</w:t>
             </w:r>
           </w:p>
         </w:tc>
@@ -161,7 +188,7 @@
           </w:tcPr>
           <w:p>
             <w:r>
-              <w:t>effectiveDate</w:t>
+              <w:t>Policy Period (From)</w:t>
             </w:r>
           </w:p>
         </w:tc>
@@ -171,7 +198,7 @@
           </w:tcPr>
           <w:p>
             <w:r>
-              <w:t>data.policy.effectiveDate</w:t>
+              <w:t>data.policy.startDate</w:t>
             </w:r>
           </w:p>
         </w:tc>
@@ -193,7 +220,7 @@
           </w:tcPr>
           <w:p>
             <w:r>
-              <w:t>expiryDate</w:t>
+              <w:t>Policy Period (To)</w:t>
             </w:r>
           </w:p>
         </w:tc>
@@ -203,7 +230,103 @@
           </w:tcPr>
           <w:p>
             <w:r>
-              <w:t>data.policy.expiryDate</w:t>
+              <w:t>data.policy.endDate</w:t>
+            </w:r>
+          </w:p>
+        </w:tc>
+      </w:tr>
+      <w:tr>
+        <w:tc>
+          <w:tcPr>
+            <w:tcW w:type="dxa" w:w="2880"/>
+          </w:tcPr>
+          <w:p>
+            <w:r>
+              <w:t>5</w:t>
+            </w:r>
+          </w:p>
+        </w:tc>
+        <w:tc>
+          <w:tcPr>
+            <w:tcW w:type="dxa" w:w="2880"/>
+          </w:tcPr>
+          <w:p>
+            <w:r>
+              <w:t>Premium (Own Damage + TP)</w:t>
+            </w:r>
+          </w:p>
+        </w:tc>
+        <w:tc>
+          <w:tcPr>
+            <w:tcW w:type="dxa" w:w="2880"/>
+          </w:tcPr>
+          <w:p>
+            <w:r>
+              <w:t>data.policy.premiumTotal</w:t>
+            </w:r>
+          </w:p>
+        </w:tc>
+      </w:tr>
+      <w:tr>
+        <w:tc>
+          <w:tcPr>
+            <w:tcW w:type="dxa" w:w="2880"/>
+          </w:tcPr>
+          <w:p>
+            <w:r>
+              <w:t>6</w:t>
+            </w:r>
+          </w:p>
+        </w:tc>
+        <w:tc>
+          <w:tcPr>
+            <w:tcW w:type="dxa" w:w="2880"/>
+          </w:tcPr>
+          <w:p>
+            <w:r>
+              <w:t>Insured Declared Value (IDV)</w:t>
+            </w:r>
+          </w:p>
+        </w:tc>
+        <w:tc>
+          <w:tcPr>
+            <w:tcW w:type="dxa" w:w="2880"/>
+          </w:tcPr>
+          <w:p>
+            <w:r>
+              <w:t>data.policy.idv</w:t>
+            </w:r>
+          </w:p>
+        </w:tc>
+      </w:tr>
+      <w:tr>
+        <w:tc>
+          <w:tcPr>
+            <w:tcW w:type="dxa" w:w="2880"/>
+          </w:tcPr>
+          <w:p>
+            <w:r>
+              <w:t>7</w:t>
+            </w:r>
+          </w:p>
+        </w:tc>
+        <w:tc>
+          <w:tcPr>
+            <w:tcW w:type="dxa" w:w="2880"/>
+          </w:tcPr>
+          <w:p>
+            <w:r>
+              <w:t>Compulsory Deductible</w:t>
+            </w:r>
+          </w:p>
+        </w:tc>
+        <w:tc>
+          <w:tcPr>
+            <w:tcW w:type="dxa" w:w="2880"/>
+          </w:tcPr>
+          <w:p>
+            <w:r>
+              <w:t>data.policy.compulsoryDeductible</w:t>
             </w:r>
           </w:p>
         </w:tc>

</xml_diff>